<commit_message>
Update Bitterroot and Declo packet article copy.
Fix Talbitzer award punctuation in packet 07 and add Dayton Fox photo caption in packet 08.

Co-authored-by: Cursor <cursoragent@cursor.com>
</commit_message>
<xml_diff>
--- a/tools/airtable/_preview/newspaper-radio-prep/final-packets/07-bitterroot/02 Article - Short Version.docx
+++ b/tools/airtable/_preview/newspaper-radio-prep/final-packets/07-bitterroot/02 Article - Short Version.docx
@@ -47,7 +47,15 @@
       </w:r>
       <w:proofErr w:type="spellEnd"/>
       <w:r>
-        <w:t>, a fourth-grade student at Darby, reached Beginner, Level 1 of 12, with 653 counted shots. He earned Thanks for Playing — Every Bit Counts recognition for participating in the challenge and logging his shooting work.</w:t>
+        <w:t xml:space="preserve">, a fourth-grade student at Darby, reached Beginner, Level 1 of 12, with 653 counted shots. He earned Thanks for Playing </w:t>
+      </w:r>
+      <w:r>
+        <w:t xml:space="preserve">- </w:t>
+      </w:r>
+      <w:bookmarkStart w:id="0" w:name="_GoBack"/>
+      <w:bookmarkEnd w:id="0"/>
+      <w:r>
+        <w:t>Every Bit Counts recognition for participating in the challenge and logging his shooting work.</w:t>
       </w:r>
     </w:p>
     <w:p/>
@@ -72,8 +80,6 @@
       <w:r>
         <w:t xml:space="preserve"> participation showed one of the goals of the program: helping athletes begin the habit of doing the work, tracking it, and continuing to improve.</w:t>
       </w:r>
-      <w:bookmarkStart w:id="0" w:name="_GoBack"/>
-      <w:bookmarkEnd w:id="0"/>
     </w:p>
     <w:sectPr>
       <w:pgSz w:w="12240" w:h="15840"/>

</xml_diff>